<commit_message>
feat: Completion of Sprint 8
</commit_message>
<xml_diff>
--- a/Sprint 6.docx
+++ b/Sprint 6.docx
@@ -89,37 +89,6 @@
     </w:p>
     <w:p>
       <w:pPr>
-        <w:numPr>
-          <w:ilvl w:val="0"/>
-          <w:numId w:val="1"/>
-        </w:numPr>
-        <w:rPr>
-          <w:rFonts w:cs="Times New Roman"/>
-        </w:rPr>
-      </w:pPr>
-      <w:r>
-        <w:rPr>
-          <w:rFonts w:cs="Times New Roman"/>
-        </w:rPr>
-        <w:t xml:space="preserve">Notifications: </w:t>
-      </w:r>
-      <w:proofErr w:type="spellStart"/>
-      <w:r>
-        <w:rPr>
-          <w:rFonts w:cs="Times New Roman"/>
-        </w:rPr>
-        <w:t>EmailJS</w:t>
-      </w:r>
-      <w:proofErr w:type="spellEnd"/>
-      <w:r>
-        <w:rPr>
-          <w:rFonts w:cs="Times New Roman"/>
-        </w:rPr>
-        <w:t xml:space="preserve"> for contact forms and order confirmations</w:t>
-      </w:r>
-    </w:p>
-    <w:p>
-      <w:pPr>
         <w:rPr>
           <w:rFonts w:cs="Times New Roman"/>
         </w:rPr>
@@ -498,7 +467,6 @@
         <w:rPr>
           <w:rFonts w:cs="Times New Roman"/>
         </w:rPr>
-        <w:lastRenderedPageBreak/>
         <w:t>Sprint 8: Final Polishing &amp; Deployment</w:t>
       </w:r>
       <w:bookmarkEnd w:id="2"/>
@@ -552,6 +520,7 @@
         <w:rPr>
           <w:rFonts w:cs="Times New Roman"/>
         </w:rPr>
+        <w:lastRenderedPageBreak/>
         <w:t>Final styling polish with Tailwind + Atomic Components</w:t>
       </w:r>
     </w:p>
@@ -926,10 +895,33 @@
         <w:rPr>
           <w:rFonts w:cs="Times New Roman"/>
         </w:rPr>
+        <w:t xml:space="preserve">Seller </w:t>
+      </w:r>
+      <w:r>
+        <w:rPr>
+          <w:rFonts w:cs="Times New Roman"/>
+        </w:rPr>
         <w:t>Bank Account Page</w:t>
       </w:r>
     </w:p>
     <w:p>
+      <w:pPr>
+        <w:numPr>
+          <w:ilvl w:val="0"/>
+          <w:numId w:val="10"/>
+        </w:numPr>
+        <w:rPr>
+          <w:rFonts w:cs="Times New Roman"/>
+        </w:rPr>
+      </w:pPr>
+      <w:r>
+        <w:rPr>
+          <w:rFonts w:cs="Times New Roman"/>
+        </w:rPr>
+        <w:t>Documentation Page</w:t>
+      </w:r>
+    </w:p>
+    <w:p>
       <w:r>
         <w:t xml:space="preserve">Let's work on sprint </w:t>
       </w:r>
@@ -940,7 +932,28 @@
         <w:t>. I want you to satisfy the requirements and also make the pages. Give me a clear implementation plan and do not skip anything. I have given you the designs of the pages in the Pics folder (Sprint</w:t>
       </w:r>
       <w:r>
-        <w:t xml:space="preserve"> 6</w:t>
+        <w:t xml:space="preserve"> </w:t>
+      </w:r>
+      <w:r>
+        <w:t xml:space="preserve">8 Part 1, </w:t>
+      </w:r>
+      <w:r>
+        <w:t>Sprint</w:t>
+      </w:r>
+      <w:r>
+        <w:t xml:space="preserve"> 8 Part</w:t>
+      </w:r>
+      <w:r>
+        <w:t xml:space="preserve"> 2, &amp; </w:t>
+      </w:r>
+      <w:r>
+        <w:t>Sprint</w:t>
+      </w:r>
+      <w:r>
+        <w:t xml:space="preserve"> 8 Part</w:t>
+      </w:r>
+      <w:r>
+        <w:t xml:space="preserve"> 3</w:t>
       </w:r>
       <w:r>
         <w:t>). If you have any questions, ask before making the implementation plan. And don't use any mock data, instead ask me for the credentials you need.</w:t>
@@ -952,6 +965,7 @@
         <w:br/>
       </w:r>
     </w:p>
+    <w:p/>
     <w:p/>
     <w:sectPr>
       <w:pgSz w:w="12240" w:h="15840"/>
@@ -2888,7 +2902,7 @@
   <w:style w:type="paragraph" w:default="1" w:styleId="Normal">
     <w:name w:val="Normal"/>
     <w:qFormat/>
-    <w:rsid w:val="0023181A"/>
+    <w:rsid w:val="007F1652"/>
     <w:pPr>
       <w:spacing w:before="120" w:after="120" w:line="240" w:lineRule="auto"/>
     </w:pPr>
@@ -3108,6 +3122,7 @@
   <w:style w:type="character" w:default="1" w:styleId="DefaultParagraphFont">
     <w:name w:val="Default Paragraph Font"/>
     <w:uiPriority w:val="1"/>
+    <w:semiHidden/>
     <w:unhideWhenUsed/>
   </w:style>
   <w:style w:type="table" w:default="1" w:styleId="TableNormal">

</xml_diff>